<commit_message>
Update Bible reference text data for 2026-07-06
</commit_message>
<xml_diff>
--- a/fra/docx/17.content.docx
+++ b/fra/docx/17.content.docx
@@ -1028,7 +1028,7 @@
         <w:rPr>
           <w:lang w:val="fr_FR" w:bidi="fr_FR"/>
         </w:rPr>
-        <w:t xml:space="preserve"> Le roi aima</w:t>
+        <w:t xml:space="preserve"> Le roi aima Esther plus que toutes les autres femmes. Elle trouva grâce et faveur à ses yeux plus que toutes les autres jeunes filles. Il mit la couronne royale sur sa tête, et la fit reine à la place de Vasthi.</w:t>
       </w:r>
     </w:p>
     <w:p>
@@ -1049,7 +1049,7 @@
         <w:rPr>
           <w:lang w:val="fr_FR" w:bidi="fr_FR"/>
         </w:rPr>
-        <w:t xml:space="preserve"> Esther plus que toutes les autres femmes. Elle trouva grâce et faveur à ses yeux plus que toutes les autres jeunes filles. Il mit la couronne royale sur sa tête, et la fit reine à la place de Vasthi. Le roi donna en l’honneur d’Esther un grand festin à tous ses princes et à ses serviteurs. Il accorda du repos aux provinces, et fit des cadeaux avec une générosité digne d’un roi.</w:t>
+        <w:t xml:space="preserve"> Le roi donna en l’honneur d’Esther un grand festin à tous ses princes et à ses serviteurs. Il accorda du repos aux provinces, et fit des cadeaux avec une générosité digne d’un roi.</w:t>
       </w:r>
     </w:p>
     <w:p>
@@ -1112,7 +1112,7 @@
         <w:rPr>
           <w:lang w:val="fr_FR" w:bidi="fr_FR"/>
         </w:rPr>
-        <w:t xml:space="preserve"> À cette époque, alors que Mardochée était assis à la porte du roi, Bigthan et Théresch, deux</w:t>
+        <w:t xml:space="preserve"> À cette époque, alors que Mardochée était assis à la porte du roi, Bigthan et Théresch, deux eunuques du roi qui étaient gardes du seuil, se mirent en colère. Ils voulurent tuer le roi Assuérus.</w:t>
       </w:r>
     </w:p>
     <w:p>
@@ -1133,7 +1133,7 @@
         <w:rPr>
           <w:lang w:val="fr_FR" w:bidi="fr_FR"/>
         </w:rPr>
-        <w:t xml:space="preserve"> eunuques du roi qui étaient gardes du seuil, se mirent en colère. Ils voulurent tuer le roi Assuérus. Mardochée apprit cela et en informa la reine Esther, qui le dit au roi de la part de Mardochée.</w:t>
+        <w:t xml:space="preserve"> Mardochée apprit cela et en informa la reine Esther, qui le dit au roi de la part de Mardochée.</w:t>
       </w:r>
     </w:p>
     <w:p>
@@ -3823,7 +3823,7 @@
         <w:rPr>
           <w:lang w:val="fr_FR" w:bidi="fr_FR"/>
         </w:rPr>
-        <w:t xml:space="preserve"> Tous les</w:t>
+        <w:t xml:space="preserve"> Tous les faits concernant sa puissance et ses exploits, et les détails sur la grandeur à laquelle le roi éleva Mardochée, ne sont-ils pas écrits dans le livre des Chroniques des rois des Mèdes et des Perses ?</w:t>
       </w:r>
     </w:p>
     <w:p>
@@ -3844,7 +3844,7 @@
         <w:rPr>
           <w:lang w:val="fr_FR" w:bidi="fr_FR"/>
         </w:rPr>
-        <w:t xml:space="preserve"> faits concernant sa puissance et ses exploits, et les détails sur la grandeur à laquelle le roi éleva Mardochée, ne sont-ils pas écrits dans le livre des Chroniques des rois des Mèdes et des Perses ? Car le Juif Mardochée était le premier après le roi Assuérus. Il était grand parmi les Juifs et aimé de la multitude de ses frères. Il recherchait le bien de son peuple et parlait pour la paix de toute son ethnie.</w:t>
+        <w:t xml:space="preserve"> Car le Juif Mardochée était le premier après le roi Assuérus. Il était grand parmi les Juifs et aimé de la multitude de ses frères. Il recherchait le bien de son peuple et parlait pour la paix de toute son ethnie.</w:t>
       </w:r>
     </w:p>
     <w:sectPr>

</xml_diff>